<commit_message>
Añadir formulario, campos de otrosi, enlace secop y formato de fecha en lista contratos
</commit_message>
<xml_diff>
--- a/plantillas/INVERSION_1_ESTUDIOS_PREVIOS.docx
+++ b/plantillas/INVERSION_1_ESTUDIOS_PREVIOS.docx
@@ -75,7 +75,7 @@
           <w:sz w:val="24"/>
           <w:szCs w:val="24"/>
         </w:rPr>
-        <w:t>Ficha EBI No. {{CODIGO_PROYECTO}} “{{NOMBRE_PROYECTO}}”</w:t>
+        <w:t>Ficha EBI No. {{EBI_NUMERO}} “{{NOMBRE_PROYECTO}}”</w:t>
       </w:r>
     </w:p>
     <w:p>
@@ -103,8 +103,6 @@
         </w:rPr>
         <w:t>2024760010018</w:t>
       </w:r>
-      <w:bookmarkStart w:id="0" w:name="_GoBack"/>
-      <w:bookmarkEnd w:id="0"/>
     </w:p>
     <w:p>
       <w:pPr>
@@ -144,8 +142,8 @@
           <w:szCs w:val="24"/>
         </w:rPr>
       </w:pPr>
-      <w:bookmarkStart w:id="1" w:name="_heading=h.ps8zxrn29i9u" w:colFirst="0" w:colLast="0"/>
-      <w:bookmarkEnd w:id="1"/>
+      <w:bookmarkStart w:id="0" w:name="_heading=h.ps8zxrn29i9u" w:colFirst="0" w:colLast="0"/>
+      <w:bookmarkEnd w:id="0"/>
       <w:r>
         <w:rPr>
           <w:rFonts w:ascii="Arial" w:eastAsia="Arial" w:hAnsi="Arial" w:cs="Arial"/>
@@ -1199,23 +1197,7 @@
           <w:sz w:val="24"/>
           <w:szCs w:val="24"/>
         </w:rPr>
-        <w:t>Contrato de prestación de servicios profesionales_{{</w:t>
-      </w:r>
-      <w:r>
-        <w:rPr>
-          <w:rFonts w:ascii="Arial" w:eastAsia="Arial" w:hAnsi="Arial" w:cs="Arial"/>
-          <w:sz w:val="24"/>
-          <w:szCs w:val="24"/>
-        </w:rPr>
-        <w:t>NIVEL_CONTRATO_MARCA</w:t>
-      </w:r>
-      <w:r>
-        <w:rPr>
-          <w:rFonts w:ascii="Arial" w:eastAsia="Arial" w:hAnsi="Arial" w:cs="Arial"/>
-          <w:sz w:val="24"/>
-          <w:szCs w:val="24"/>
-        </w:rPr>
-        <w:t>}} ___</w:t>
+        <w:t>Contrato de prestación de servicios profesionales_{{ MARCA_PROFESIONAL}} ___</w:t>
       </w:r>
     </w:p>
     <w:p>
@@ -1241,23 +1223,7 @@
           <w:sz w:val="24"/>
           <w:szCs w:val="24"/>
         </w:rPr>
-        <w:t>Contrato de prestación de servicios de apoyo _{{</w:t>
-      </w:r>
-      <w:r>
-        <w:rPr>
-          <w:rFonts w:ascii="Arial" w:eastAsia="Arial" w:hAnsi="Arial" w:cs="Arial"/>
-          <w:sz w:val="24"/>
-          <w:szCs w:val="24"/>
-        </w:rPr>
-        <w:t>NIVEL_CONTRATO_MARCA</w:t>
-      </w:r>
-      <w:r>
-        <w:rPr>
-          <w:rFonts w:ascii="Arial" w:eastAsia="Arial" w:hAnsi="Arial" w:cs="Arial"/>
-          <w:sz w:val="24"/>
-          <w:szCs w:val="24"/>
-        </w:rPr>
-        <w:t>}}________</w:t>
+        <w:t>Contrato de prestación de servicios de apoyo _{{MARCA_APOYO}}________</w:t>
       </w:r>
     </w:p>
     <w:p>
@@ -2020,8 +1986,8 @@
           <w:szCs w:val="24"/>
         </w:rPr>
       </w:pPr>
-      <w:bookmarkStart w:id="2" w:name="_heading=h.4r6sqhy77vwo" w:colFirst="0" w:colLast="0"/>
-      <w:bookmarkEnd w:id="2"/>
+      <w:bookmarkStart w:id="1" w:name="_heading=h.4r6sqhy77vwo" w:colFirst="0" w:colLast="0"/>
+      <w:bookmarkEnd w:id="1"/>
       <w:r>
         <w:rPr>
           <w:rFonts w:ascii="Arial" w:eastAsia="Arial" w:hAnsi="Arial" w:cs="Arial"/>
@@ -3740,24 +3706,17 @@
                 <w:szCs w:val="24"/>
                 <w:lang w:val="es-CO"/>
               </w:rPr>
-              <w:t>{{PERFIL_FORMACION}}</w:t>
-            </w:r>
-          </w:p>
-        </w:tc>
-        <w:tc>
-          <w:tcPr>
-            <w:tcW w:w="4363" w:type="dxa"/>
-          </w:tcPr>
-          <w:p>
-            <w:pPr>
-              <w:jc w:val="both"/>
+              <w:t>{{</w:t>
+            </w:r>
+            <w:r>
               <w:rPr>
                 <w:rFonts w:ascii="Arial" w:eastAsia="Arial" w:hAnsi="Arial" w:cs="Arial"/>
                 <w:sz w:val="24"/>
                 <w:szCs w:val="24"/>
                 <w:lang w:val="es-CO"/>
               </w:rPr>
-            </w:pPr>
+              <w:t>IDONEIDAD_FORMACION</w:t>
+            </w:r>
             <w:r>
               <w:rPr>
                 <w:rFonts w:ascii="Arial" w:eastAsia="Arial" w:hAnsi="Arial" w:cs="Arial"/>
@@ -3765,7 +3724,52 @@
                 <w:szCs w:val="24"/>
                 <w:lang w:val="es-CO"/>
               </w:rPr>
-              <w:t>{{PERFIL_EXPERIENCIA}}</w:t>
+              <w:t>}}</w:t>
+            </w:r>
+          </w:p>
+        </w:tc>
+        <w:tc>
+          <w:tcPr>
+            <w:tcW w:w="4363" w:type="dxa"/>
+          </w:tcPr>
+          <w:p>
+            <w:pPr>
+              <w:jc w:val="both"/>
+              <w:rPr>
+                <w:rFonts w:ascii="Arial" w:eastAsia="Arial" w:hAnsi="Arial" w:cs="Arial"/>
+                <w:sz w:val="24"/>
+                <w:szCs w:val="24"/>
+                <w:lang w:val="es-CO"/>
+              </w:rPr>
+            </w:pPr>
+            <w:r>
+              <w:rPr>
+                <w:rFonts w:ascii="Arial" w:eastAsia="Arial" w:hAnsi="Arial" w:cs="Arial"/>
+                <w:sz w:val="24"/>
+                <w:szCs w:val="24"/>
+                <w:lang w:val="es-CO"/>
+              </w:rPr>
+              <w:t>{{</w:t>
+            </w:r>
+            <w:r>
+              <w:rPr>
+                <w:rFonts w:ascii="Arial" w:eastAsia="Arial" w:hAnsi="Arial" w:cs="Arial"/>
+                <w:sz w:val="24"/>
+                <w:szCs w:val="24"/>
+                <w:lang w:val="es-CO"/>
+              </w:rPr>
+              <w:t>EXPERIENCIA_BASICA</w:t>
+            </w:r>
+            <w:bookmarkStart w:id="2" w:name="_GoBack"/>
+            <w:bookmarkEnd w:id="2"/>
+            <w:r>
+              <w:rPr>
+                <w:rFonts w:ascii="Arial" w:eastAsia="Arial" w:hAnsi="Arial" w:cs="Arial"/>
+                <w:sz w:val="24"/>
+                <w:szCs w:val="24"/>
+                <w:lang w:val="es-CO"/>
+              </w:rPr>
+              <w:t>}}</w:t>
             </w:r>
           </w:p>
         </w:tc>
@@ -11349,23 +11353,7 @@
           <w:sz w:val="24"/>
           <w:szCs w:val="24"/>
         </w:rPr>
-        <w:t>El valor estimado del contrato es la suma de {{VALOR_CONTRATO_LETRAS}}</w:t>
-      </w:r>
-      <w:r>
-        <w:rPr>
-          <w:rFonts w:ascii="Arial" w:eastAsia="Arial" w:hAnsi="Arial" w:cs="Arial"/>
-          <w:sz w:val="24"/>
-          <w:szCs w:val="24"/>
-        </w:rPr>
-        <w:t xml:space="preserve"> </w:t>
-      </w:r>
-      <w:r>
-        <w:rPr>
-          <w:rFonts w:ascii="Arial" w:eastAsia="Arial" w:hAnsi="Arial" w:cs="Arial"/>
-          <w:sz w:val="24"/>
-          <w:szCs w:val="24"/>
-        </w:rPr>
-        <w:t>({{VALOR_CONTRATO}})</w:t>
+        <w:t>El valor estimado del contrato es la suma de {{VALOR_CONTRATO_LETRAS}} ({{VALOR_CONTRATO}})</w:t>
       </w:r>
     </w:p>
     <w:p>
@@ -15079,7 +15067,7 @@
                 <w:sz w:val="16"/>
                 <w:szCs w:val="16"/>
               </w:rPr>
-              <w:t>1</w:t>
+              <w:t>9</w:t>
             </w:r>
             <w:r>
               <w:rPr>
@@ -18631,6 +18619,18 @@
   </wne:recipientData>
   <wne:recipientData>
     <wne:active wne:val="0"/>
+  </wne:recipientData>
+  <wne:recipientData>
+    <wne:active wne:val="1"/>
+  </wne:recipientData>
+  <wne:recipientData>
+    <wne:active wne:val="1"/>
+  </wne:recipientData>
+  <wne:recipientData>
+    <wne:active wne:val="1"/>
+  </wne:recipientData>
+  <wne:recipientData>
+    <wne:active wne:val="1"/>
   </wne:recipientData>
   <wne:recipientData>
     <wne:active wne:val="1"/>
@@ -21711,7 +21711,7 @@
 </file>
 
 <file path=customXml/itemProps2.xml><?xml version="1.0" encoding="utf-8"?>
-<ds:datastoreItem xmlns:ds="http://schemas.openxmlformats.org/officeDocument/2006/customXml" ds:itemID="{42289B64-8598-4815-A616-E1511F14A1BA}">
+<ds:datastoreItem xmlns:ds="http://schemas.openxmlformats.org/officeDocument/2006/customXml" ds:itemID="{4EEBA995-8C21-4F49-B73E-7F42235C9179}">
   <ds:schemaRefs>
     <ds:schemaRef ds:uri="http://schemas.openxmlformats.org/officeDocument/2006/bibliography"/>
   </ds:schemaRefs>

</xml_diff>

<commit_message>
feat: agregar generacion de documentos de modificacion (F001 y F002) - Nuevas plantillas MODIFICACION_1_JUSTIFICACION y MODIFICACION_2_ACEPTACION - Nuevas acciones generateModificacion y downloadZipModificacion en CombinacionServlet - Botones de Modificaciones en la UI de combinacion_contratistas.jsp - Mapeo de fechas: FECHA_ACTA_INICIO -> fechaEjecucion, FECHA_SUSCRIPCION -> fechaAprobacion - FECHA_FIN_CONTRATO en formato letras y numeros: 'Treinta (30) de junio del dos mil veintiseis (2026)' - PRORROGAS, ACLARACION, SUSPENSION, REANUDACION mapeados a N/A - Campos de cesion con N/A fijo en plantilla - Supervisor: NOMBRE y CARGO mapeados desde BD - CIUDAD_Y_FECHA_HOY con fecha actual del sistema - ADICION_X: marca X si el contrato tiene adicion - Dependencia xmlbeans 5.1.1 agregada al pom.xml para resolver ClassNotFoundException en Tomcat
</commit_message>
<xml_diff>
--- a/plantillas/INVERSION_1_ESTUDIOS_PREVIOS.docx
+++ b/plantillas/INVERSION_1_ESTUDIOS_PREVIOS.docx
@@ -3530,7 +3530,23 @@
           <w:sz w:val="24"/>
           <w:szCs w:val="24"/>
         </w:rPr>
-        <w:t>Con el presente contrato, se planea cumplir con la actividad específica: Apoyar {{ACTIVIDADES_CONTRACTUALES}}</w:t>
+        <w:t>Con el presente contrato, se planea cumplir con la actividad específica: Apoyar {{</w:t>
+      </w:r>
+      <w:r>
+        <w:rPr>
+          <w:rFonts w:ascii="Arial" w:eastAsia="Arial" w:hAnsi="Arial" w:cs="Arial"/>
+          <w:sz w:val="24"/>
+          <w:szCs w:val="24"/>
+        </w:rPr>
+        <w:t>ACTIVIDAD_ESPECIFICA_EBI</w:t>
+      </w:r>
+      <w:r>
+        <w:rPr>
+          <w:rFonts w:ascii="Arial" w:eastAsia="Arial" w:hAnsi="Arial" w:cs="Arial"/>
+          <w:sz w:val="24"/>
+          <w:szCs w:val="24"/>
+        </w:rPr>
+        <w:t>}}</w:t>
       </w:r>
     </w:p>
     <w:p>
@@ -3760,8 +3776,6 @@
               </w:rPr>
               <w:t>EXPERIENCIA_BASICA</w:t>
             </w:r>
-            <w:bookmarkStart w:id="2" w:name="_GoBack"/>
-            <w:bookmarkEnd w:id="2"/>
             <w:r>
               <w:rPr>
                 <w:rFonts w:ascii="Arial" w:eastAsia="Arial" w:hAnsi="Arial" w:cs="Arial"/>
@@ -3817,8 +3831,28 @@
           <w:sz w:val="24"/>
           <w:szCs w:val="24"/>
         </w:rPr>
-        <w:t>En este entendido y revisada la planta de personal de la Entidad, se ha podido establecer que no se cuenta con personal suficiente que atienda funciones o desarrolle actividades iguales o relacionadas con el asunto objeto de contratación y actividades antes descritas, como se acredita con la certificación que en tal sentido ha expedido el Subdirector de Gestión Estratégica del Talento Humano del Departamento Administrativo de Desarrollo e Innovación Institucional de la Alcaldía de Santiago de Cali, mediante oficio No. 202641370400000064 del 3 de {{MES_ANIO_ACTUAL}}.</w:t>
-      </w:r>
+        <w:t xml:space="preserve">En este entendido y revisada la planta de personal de la Entidad, se ha podido establecer que no se cuenta con personal suficiente que atienda funciones o desarrolle actividades iguales o relacionadas con el asunto objeto de contratación y actividades antes descritas, como se acredita con la certificación que en tal sentido ha expedido el Subdirector de Gestión Estratégica del Talento Humano del Departamento Administrativo de Desarrollo e Innovación Institucional de la Alcaldía de Santiago de Cali, mediante oficio No. 202641370400000064 </w:t>
+      </w:r>
+      <w:r>
+        <w:rPr>
+          <w:rFonts w:ascii="Arial" w:eastAsia="Arial" w:hAnsi="Arial" w:cs="Arial"/>
+          <w:color w:val="000000"/>
+          <w:sz w:val="24"/>
+          <w:szCs w:val="24"/>
+        </w:rPr>
+        <w:t>del 3 de enero de 2026</w:t>
+      </w:r>
+      <w:r>
+        <w:rPr>
+          <w:rFonts w:ascii="Arial" w:eastAsia="Arial" w:hAnsi="Arial" w:cs="Arial"/>
+          <w:color w:val="000000"/>
+          <w:sz w:val="24"/>
+          <w:szCs w:val="24"/>
+        </w:rPr>
+        <w:t>.</w:t>
+      </w:r>
+      <w:bookmarkStart w:id="2" w:name="_GoBack"/>
+      <w:bookmarkEnd w:id="2"/>
     </w:p>
     <w:p>
       <w:pPr>
@@ -18619,6 +18653,9 @@
   </wne:recipientData>
   <wne:recipientData>
     <wne:active wne:val="0"/>
+  </wne:recipientData>
+  <wne:recipientData>
+    <wne:active wne:val="1"/>
   </wne:recipientData>
   <wne:recipientData>
     <wne:active wne:val="1"/>
@@ -21685,7 +21722,7 @@
   <a:extraClrSchemeLst/>
   <a:extLst>
     <a:ext uri="{05A4C25C-085E-4340-85A3-A5531E510DB2}">
-      <thm15:themeFamily xmlns:thm15="http://schemas.microsoft.com/office/thememl/2012/main" xmlns="" name="Office Theme" id="{62F939B6-93AF-4DB8-9C6B-D6C7DFDC589F}" vid="{4A3C46E8-61CC-4603-A589-7422A47A8E4A}"/>
+      <thm15:themeFamily xmlns="" xmlns:thm15="http://schemas.microsoft.com/office/thememl/2012/main" name="Office Theme" id="{62F939B6-93AF-4DB8-9C6B-D6C7DFDC589F}" vid="{4A3C46E8-61CC-4603-A589-7422A47A8E4A}"/>
     </a:ext>
   </a:extLst>
 </a:theme>
@@ -21711,7 +21748,7 @@
 </file>
 
 <file path=customXml/itemProps2.xml><?xml version="1.0" encoding="utf-8"?>
-<ds:datastoreItem xmlns:ds="http://schemas.openxmlformats.org/officeDocument/2006/customXml" ds:itemID="{4EEBA995-8C21-4F49-B73E-7F42235C9179}">
+<ds:datastoreItem xmlns:ds="http://schemas.openxmlformats.org/officeDocument/2006/customXml" ds:itemID="{90F823D0-499A-4680-A6C0-CD210ECF8ADB}">
   <ds:schemaRefs>
     <ds:schemaRef ds:uri="http://schemas.openxmlformats.org/officeDocument/2006/bibliography"/>
   </ds:schemaRefs>

</xml_diff>

<commit_message>
Actualización del sistema de combinación: mapeo de campos, generación de documentos y correcciones finales en servlets y DAOs
</commit_message>
<xml_diff>
--- a/plantillas/INVERSION_1_ESTUDIOS_PREVIOS.docx
+++ b/plantillas/INVERSION_1_ESTUDIOS_PREVIOS.docx
@@ -1986,20 +1986,18 @@
           <w:szCs w:val="24"/>
         </w:rPr>
       </w:pPr>
-      <w:bookmarkStart w:id="1" w:name="_GoBack"/>
+    </w:p>
+    <w:p>
+      <w:pPr>
+        <w:jc w:val="both"/>
+        <w:rPr>
+          <w:rFonts w:ascii="Arial" w:eastAsia="Arial" w:hAnsi="Arial" w:cs="Arial"/>
+          <w:sz w:val="24"/>
+          <w:szCs w:val="24"/>
+        </w:rPr>
+      </w:pPr>
+      <w:bookmarkStart w:id="1" w:name="_heading=h.4r6sqhy77vwo" w:colFirst="0" w:colLast="0"/>
       <w:bookmarkEnd w:id="1"/>
-    </w:p>
-    <w:p>
-      <w:pPr>
-        <w:jc w:val="both"/>
-        <w:rPr>
-          <w:rFonts w:ascii="Arial" w:eastAsia="Arial" w:hAnsi="Arial" w:cs="Arial"/>
-          <w:sz w:val="24"/>
-          <w:szCs w:val="24"/>
-        </w:rPr>
-      </w:pPr>
-      <w:bookmarkStart w:id="2" w:name="_heading=h.4r6sqhy77vwo" w:colFirst="0" w:colLast="0"/>
-      <w:bookmarkEnd w:id="2"/>
       <w:r>
         <w:rPr>
           <w:rFonts w:ascii="Arial" w:eastAsia="Arial" w:hAnsi="Arial" w:cs="Arial"/>
@@ -3284,6 +3282,17 @@
           <w:szCs w:val="24"/>
         </w:rPr>
       </w:pPr>
+    </w:p>
+    <w:p>
+      <w:pPr>
+        <w:ind w:right="-106"/>
+        <w:jc w:val="both"/>
+        <w:rPr>
+          <w:rFonts w:ascii="Arial" w:eastAsia="Arial" w:hAnsi="Arial" w:cs="Arial"/>
+          <w:sz w:val="24"/>
+          <w:szCs w:val="24"/>
+        </w:rPr>
+      </w:pPr>
       <w:r>
         <w:rPr>
           <w:rFonts w:ascii="Arial" w:eastAsia="Arial" w:hAnsi="Arial" w:cs="Arial"/>
@@ -3503,7 +3512,23 @@
           <w:sz w:val="24"/>
           <w:szCs w:val="24"/>
         </w:rPr>
-        <w:t xml:space="preserve">Para efectos de lo anterior, en la ficha EBI No. {{CODIGO_PROYECTO}} del proyecto en mención, se planteó la ejecución de varias actividades, dentro de las cuales se encuentran: Realizar seguimiento y control de la actividad litigiosa; Apoyar la etapa de cumplimiento y pago de sentencias y acuerdos conciliatorios del Distrito de Santiago de Cali; Apoyar la gestión jurídica normativa, en acciones que encaminen a brindar seguridad jurídica; Adquirir suministros  de apoyo para la actividad jurídica y judicial; Realizar jornadas de gestión del conocimiento en el ciclo de defensa jurídica y actualización normativa; Diseñar metodología de aprendizaje, para la adquisición y reaprendizaje del conocimiento tácito y explícito; Realizar la identificación de normas de carácter general y abstracto, que puedan ser identificadas como depurables y aplicar los criterios para su depuración; Realizar la identificación de normas de carácter general y abstracto, que puedan ser identificadas como depurables y aplicar los criterios para su </w:t>
+        <w:t xml:space="preserve">Para efectos de lo anterior, en la ficha EBI No. </w:t>
+      </w:r>
+      <w:r>
+        <w:rPr>
+          <w:rFonts w:ascii="Arial" w:eastAsia="Arial" w:hAnsi="Arial" w:cs="Arial"/>
+          <w:sz w:val="24"/>
+          <w:szCs w:val="24"/>
+        </w:rPr>
+        <w:t>{{EBI_NUMERO}}</w:t>
+      </w:r>
+      <w:r>
+        <w:rPr>
+          <w:rFonts w:ascii="Arial" w:eastAsia="Arial" w:hAnsi="Arial" w:cs="Arial"/>
+          <w:sz w:val="24"/>
+          <w:szCs w:val="24"/>
+        </w:rPr>
+        <w:t xml:space="preserve"> del proyecto en mención, se planteó la ejecución de varias actividades, dentro de las cuales se encuentran: Realizar seguimiento y control de la actividad litigiosa; Apoyar la etapa de cumplimiento y pago de sentencias y acuerdos conciliatorios del Distrito de Santiago de Cali; Apoyar la gestión jurídica normativa, en acciones que encaminen a brindar seguridad jurídica; Adquirir suministros  de apoyo para la actividad jurídica y judicial; Realizar jornadas de gestión del conocimiento en el ciclo de defensa jurídica y actualización normativa; Diseñar metodología de aprendizaje, para la adquisición y reaprendizaje del conocimiento tácito y explícito; Realizar la identificación de normas de carácter general y abstracto, que puedan ser identificadas como depurables y aplicar los criterios para su depuración; Realizar la identificación de normas de carácter general y abstracto, que puedan ser identificadas como depurables y aplicar los criterios para su </w:t>
       </w:r>
       <w:r>
         <w:rPr>
@@ -3843,7 +3868,7 @@
           <w:sz w:val="24"/>
           <w:szCs w:val="24"/>
         </w:rPr>
-        <w:t xml:space="preserve">En este entendido y revisada la planta de personal de la Entidad, se ha podido establecer que no se cuenta con personal suficiente que atienda funciones o desarrolle actividades iguales o relacionadas con el asunto objeto de contratación y actividades antes descritas, como se acredita con la certificación que en tal sentido ha expedido el Subdirector de Gestión Estratégica del Talento Humano del Departamento Administrativo de Desarrollo e Innovación Institucional de la Alcaldía de Santiago de Cali, mediante oficio No. 202641370400000064 </w:t>
+        <w:t xml:space="preserve">En este entendido y revisada la planta de personal de la Entidad, se ha podido establecer que no se cuenta con personal suficiente que atienda funciones o desarrolle actividades iguales o relacionadas con el asunto objeto de contratación y actividades antes descritas, como se acredita con la certificación que en tal sentido ha expedido el Subdirector de Gestión Estratégica del Talento Humano del Departamento Administrativo de Desarrollo e Innovación Institucional de la Alcaldía de Santiago de Cali, mediante oficio No. </w:t>
       </w:r>
       <w:r>
         <w:rPr>
@@ -3852,7 +3877,16 @@
           <w:sz w:val="24"/>
           <w:szCs w:val="24"/>
         </w:rPr>
-        <w:t>del 3 de enero de 2026</w:t>
+        <w:t>{{CERTIFICADO_INSUFICIENCIA}}</w:t>
+      </w:r>
+      <w:r>
+        <w:rPr>
+          <w:rFonts w:ascii="Arial" w:eastAsia="Arial" w:hAnsi="Arial" w:cs="Arial"/>
+          <w:color w:val="000000"/>
+          <w:sz w:val="24"/>
+          <w:szCs w:val="24"/>
+        </w:rPr>
+        <w:t>-Certificado de Insuficiencia de Personal</w:t>
       </w:r>
       <w:r>
         <w:rPr>
@@ -4661,8 +4695,8 @@
           <w:szCs w:val="24"/>
         </w:rPr>
       </w:pPr>
-      <w:bookmarkStart w:id="3" w:name="_heading=h.as67lgeciqr3" w:colFirst="0" w:colLast="0"/>
-      <w:bookmarkEnd w:id="3"/>
+      <w:bookmarkStart w:id="2" w:name="_heading=h.as67lgeciqr3" w:colFirst="0" w:colLast="0"/>
+      <w:bookmarkEnd w:id="2"/>
       <w:r>
         <w:rPr>
           <w:rFonts w:ascii="Arial" w:eastAsia="Arial" w:hAnsi="Arial" w:cs="Arial"/>
@@ -5601,8 +5635,8 @@
           <w:szCs w:val="24"/>
         </w:rPr>
       </w:pPr>
-      <w:bookmarkStart w:id="4" w:name="_heading=h.eg5eloko88xw" w:colFirst="0" w:colLast="0"/>
-      <w:bookmarkEnd w:id="4"/>
+      <w:bookmarkStart w:id="3" w:name="_heading=h.eg5eloko88xw" w:colFirst="0" w:colLast="0"/>
+      <w:bookmarkEnd w:id="3"/>
       <w:r>
         <w:rPr>
           <w:rFonts w:ascii="Arial" w:eastAsia="Arial" w:hAnsi="Arial" w:cs="Arial"/>
@@ -7229,7 +7263,25 @@
           <w:szCs w:val="24"/>
         </w:rPr>
         <w:lastRenderedPageBreak/>
-        <w:t>Para determinar el valor estimado del contrato de conformidad con las actividades encaminadas al cumplimiento del mismo, se ha tomado como base y referencia los valores promedios de contrataciones anteriores y especialmente la Circular 4135.010.22.2.1031.000837 del 21 de noviembre de 2025, por la cual se estableció la tabla de honorarios a aplicar en el año 2026 para los contratos de prestación de servicios profesionales y/o de apoyo a la gestión a celebrar con personas naturales y el Distrito Especial, la cual fue emitida por el Comité de Contratación del Distrito Especial.  Así mismo, se tuvo en cuenta, el plazo de ejecución, la idoneidad y la experiencia con la que debe contar el futuro contratista que se requiere para cubrir la necesidad actual del Ente Territorial.</w:t>
+        <w:t xml:space="preserve">Para determinar el valor estimado del contrato de conformidad con las actividades encaminadas al cumplimiento del mismo, se ha tomado como base y referencia los valores promedios de contrataciones anteriores y especialmente la Circular </w:t>
+      </w:r>
+      <w:r>
+        <w:rPr>
+          <w:rFonts w:ascii="Arial" w:eastAsia="Arial" w:hAnsi="Arial" w:cs="Arial"/>
+          <w:sz w:val="24"/>
+          <w:szCs w:val="24"/>
+        </w:rPr>
+        <w:t>{{CIRCULAR_HONORARIOS}}</w:t>
+      </w:r>
+      <w:bookmarkStart w:id="4" w:name="_GoBack"/>
+      <w:bookmarkEnd w:id="4"/>
+      <w:r>
+        <w:rPr>
+          <w:rFonts w:ascii="Arial" w:eastAsia="Arial" w:hAnsi="Arial" w:cs="Arial"/>
+          <w:sz w:val="24"/>
+          <w:szCs w:val="24"/>
+        </w:rPr>
+        <w:t>, por la cual se estableció la tabla de honorarios a aplicar en el año 2026 para los contratos de prestación de servicios profesionales y/o de apoyo a la gestión a celebrar con personas naturales y el Distrito Especial, la cual fue emitida por el Comité de Contratación del Distrito Especial.  Así mismo, se tuvo en cuenta, el plazo de ejecución, la idoneidad y la experiencia con la que debe contar el futuro contratista que se requiere para cubrir la necesidad actual del Ente Territorial.</w:t>
       </w:r>
     </w:p>
     <w:p>
@@ -7366,8 +7418,16 @@
           <w:sz w:val="24"/>
           <w:szCs w:val="24"/>
         </w:rPr>
+        <w:t xml:space="preserve">Los servicios profesionales y de apoyo a la gestión son un elemento esencial para el funcionamiento de las empresas y organizaciones, tanto de orden privado, como </w:t>
+      </w:r>
+      <w:r>
+        <w:rPr>
+          <w:rFonts w:ascii="Arial" w:eastAsia="Arial" w:hAnsi="Arial" w:cs="Arial"/>
+          <w:sz w:val="24"/>
+          <w:szCs w:val="24"/>
+        </w:rPr>
         <w:lastRenderedPageBreak/>
-        <w:t>Los servicios profesionales y de apoyo a la gestión son un elemento esencial para el funcionamiento de las empresas y organizaciones, tanto de orden privado, como público. Durante años, estos servicios han sido un requerimiento primordial para el desarrollo de actividades fundamentales en el mejoramiento y crecimiento económico, organizacional y operativo de las organizaciones públicas y privadas.</w:t>
+        <w:t>público. Durante años, estos servicios han sido un requerimiento primordial para el desarrollo de actividades fundamentales en el mejoramiento y crecimiento económico, organizacional y operativo de las organizaciones públicas y privadas.</w:t>
       </w:r>
     </w:p>
     <w:p>
@@ -7900,7 +7960,6 @@
               <w:rPr>
                 <w:rFonts w:ascii="Arial" w:eastAsia="Arial" w:hAnsi="Arial" w:cs="Arial"/>
               </w:rPr>
-              <w:lastRenderedPageBreak/>
               <w:t>POSTGRADO</w:t>
             </w:r>
           </w:p>
@@ -11301,6 +11360,7 @@
           <w:sz w:val="24"/>
           <w:szCs w:val="24"/>
         </w:rPr>
+        <w:lastRenderedPageBreak/>
         <w:t xml:space="preserve">No Aplica </w:t>
       </w:r>
     </w:p>
@@ -11606,6 +11666,7 @@
           <w:sz w:val="24"/>
           <w:szCs w:val="24"/>
         </w:rPr>
+        <w:lastRenderedPageBreak/>
         <w:t>Sin perjuicio de las demás obligaciones que se desprenden de la Constitución Política de Colombia, del Estatuto General de Contratación de la Administración Pública, de las particulares que correspondan a la naturaleza del contrato a celebrar, de aquellas contenidas en otros documentos del proceso y de las consignadas específicamente en el contenido del contrato, el contratista, entre otras, realizará las siguientes actividades:</w:t>
       </w:r>
     </w:p>
@@ -11688,7 +11749,7 @@
           <w:sz w:val="24"/>
           <w:szCs w:val="24"/>
         </w:rPr>
-        <w:t xml:space="preserve">A) Utilizar todos sus conocimientos e idoneidad en la ejecución del presente contrato, comprometiéndose a tramitar y entregar los productos y actividades que hacen parte del presente contrato con calidad y oportunidad. B) Presentar los informes requeridos por el contratante para el seguimiento de las tareas encomendadas. Una vez finalice el objeto del contrato, el CONTRATISTA deberá entregar al supervisor, un informe detallado de las actividades realizadas durante su ejecución indicando los asuntos asignados, tramitados y pendientes por resolver, así como los archivos físicos y magnéticos que se hubieren generado durante la ejecución del mismo, los informes antes citados deben entregarse en una (1) copia de seguridad, que deberá reposar en las instalaciones del contratante. C) Manejar la documentación a su cargo de conformidad con la Ley 594 del 2000, Ley General de Archivo, las políticas operativas del Proceso Gestión Documental, las políticas del Sistema de Gestión Documental y demás plataformas institucionales. El CONTRATISTA debe entregar inventariada al contratante y/o al supervisor, las carpetas y documentación que tenga a su cargo en virtud del desarrollo del objeto del presente contrato, entrega que deberá hacerse de acuerdo con los procedimientos establecidos por el contratante. D) El CONTRATISTA se compromete a cumplir con las normas y procedimientos sobre el Sistema de Gestión de Seguridad Social y Salud en el trabajo de la Entidad. Si en el desarrollo del objeto contractual se realizan actividades de campo y/o visitas a obras, el CONTRATISTA, a sus expensas, deberá dotarse y acudir a estos lugares con los implementos de seguridad industrial mínimos requeridos, tales como casco, botas, gafas protectoras, etc. E) En el evento en que el CONTRATISTA al momento de suscribir el presente contrato no sea responsable del impuesto a las ventas y durante la vigencia del mismo adquiera la obligación de inscribirse como responsable del impuesto a la renta, se compromete a realizar cambio ante la DIAN </w:t>
+        <w:t xml:space="preserve">A) Utilizar todos sus conocimientos e idoneidad en la ejecución del presente contrato, comprometiéndose a tramitar y entregar los productos y actividades que hacen parte del presente contrato con calidad y oportunidad. B) Presentar los informes requeridos por el contratante para el seguimiento de las tareas encomendadas. Una vez finalice el objeto del contrato, el CONTRATISTA deberá entregar al supervisor, un informe detallado de las actividades realizadas durante su ejecución indicando los asuntos asignados, tramitados y pendientes por resolver, así como los archivos físicos y magnéticos que se hubieren generado durante la ejecución del mismo, los informes antes citados deben entregarse en una (1) copia de seguridad, que deberá reposar en las instalaciones del contratante. C) Manejar la documentación a su cargo de conformidad con la Ley 594 del 2000, Ley General de Archivo, las políticas operativas del Proceso Gestión Documental, las políticas del Sistema de Gestión Documental y demás plataformas institucionales. El CONTRATISTA debe entregar inventariada al contratante y/o al supervisor, las carpetas y documentación que tenga a su cargo en virtud del desarrollo del objeto del presente contrato, entrega que deberá hacerse de acuerdo con los procedimientos establecidos por el contratante. D) El CONTRATISTA se compromete a cumplir con las normas y procedimientos sobre el Sistema de Gestión de Seguridad Social y Salud en el trabajo de la Entidad. Si en el desarrollo del objeto contractual se realizan actividades de campo y/o visitas a obras, el CONTRATISTA, a sus expensas, deberá dotarse y acudir a estos lugares con los implementos de seguridad industrial mínimos requeridos, tales como casco, botas, gafas protectoras, etc. E) En el evento en que el CONTRATISTA al momento de suscribir el presente contrato no sea responsable del impuesto a las ventas y durante la vigencia del mismo adquiera la obligación de inscribirse como responsable del impuesto a la renta, se compromete a realizar cambio ante la DIAN dentro de los términos que otorga la ley y a reportar dicha situación al CONTRATANTE para lo cual aportará el RUT actualizado, lo anterior de conformidad con normativa vigente aplicable. F) El CONTRATISTA se compromete a mantener actualizados todos </w:t>
       </w:r>
       <w:r>
         <w:rPr>
@@ -11697,7 +11758,7 @@
           <w:szCs w:val="24"/>
         </w:rPr>
         <w:lastRenderedPageBreak/>
-        <w:t xml:space="preserve">dentro de los términos que otorga la ley y a reportar dicha situación al CONTRATANTE para lo cual aportará el RUT actualizado, lo anterior de conformidad con normativa vigente aplicable. F) El CONTRATISTA se compromete a mantener actualizados todos sus documentos en la Entidad, especialmente el RUT. G) Velar por el buen uso de los bienes entregados por el supervisor o el CONTRATANTE para realizar sus actividades. H) Reportar al CONTRATANTE el número de cuenta bancaria de ahorro o corriente, donde se le ha de consignar el pago derivado de la ejecución del presente contrato. I)  Conocer y aplicar las directrices, metodologías, políticas y procedimientos enmarcados dentro de los Sistemas de Gestión y Control Integrado adoptados por la Administración Central del Distrito de Santiago de Cali y, particularmente, los que se relacionan con el objeto del presente contrato. J) Cumplir con la política de seguridad de la información establecida por la Entidad, con el fin de garantizar la confidencialidad, integridad y disponibilidad de la información bajo su responsabilidad. K) Mantener actualizado el registro en los sistemas de información del contratante en tiempo real, cuando a ello hubiere lugar. L) Toda información o formatos generados por el CONTRATISTA son propiedad de la Alcaldía de Santiago de Cali. M) Cuando se requiera utilizar dispositivos y/o equipos tecnológicos personales o de la administración para el desarrollo del objeto contractual, el CONTRATISTA garantizará que el software y/o herramientas utilizadas e instaladas para la ejecución de sus obligaciones no vulneran ninguna normativa, contrato, derecho, interés, patentes, legalidad o propiedad de tercero, y que por el contrario todo lo utilizado esté debidamente licenciado. El CONTRATISTA debe abstenerse de instalar y/o utilizar software no licenciado o autorizado en los equipos del Distrito Especial de Santiago de Cali, así como de vulnerar los derechos de autor sobre software y/o cualquier tipo de creación protegida por el régimen de propiedad intelectual, so pena de incurrir en conductas constitutivas de delitos conforme a la normatividad legal correspondiente. N) Cumplir con las estrategias, políticas y actividades en materia de transparencia, integridad, prevención y detección de la corrupción y ante cualquier conocimiento de hechos que atente contra este principio, lo hará conocer al CONTRATANTE. O) Si el prestador del servicio contratado hace parte del equipo estructurador de los procesos de contratación del organismo o cumple actividades de apoyo a la supervisión, deberá aportar la constancia de aprobación de los cursos virtuales diseñados para fortalecer la gestión contractual por el Departamento Administrativo de Contratación Pública. P)  Divulgar y aplicar la política ambiental, de seguridad y salud ocupacional establecida por el CONTRATANTE, al ejecutar sus actividades o servicios sin crear riesgo para la salud, la seguridad o el ambiente. El (la) CONTRATISTA deberá tomar todas las medidas conducentes a evitar la contaminación ambiental, la prevención de riesgos durante la ejecución de sus operaciones o </w:t>
+        <w:t xml:space="preserve">sus documentos en la Entidad, especialmente el RUT. G) Velar por el buen uso de los bienes entregados por el supervisor o el CONTRATANTE para realizar sus actividades. H) Reportar al CONTRATANTE el número de cuenta bancaria de ahorro o corriente, donde se le ha de consignar el pago derivado de la ejecución del presente contrato. I)  Conocer y aplicar las directrices, metodologías, políticas y procedimientos enmarcados dentro de los Sistemas de Gestión y Control Integrado adoptados por la Administración Central del Distrito de Santiago de Cali y, particularmente, los que se relacionan con el objeto del presente contrato. J) Cumplir con la política de seguridad de la información establecida por la Entidad, con el fin de garantizar la confidencialidad, integridad y disponibilidad de la información bajo su responsabilidad. K) Mantener actualizado el registro en los sistemas de información del contratante en tiempo real, cuando a ello hubiere lugar. L) Toda información o formatos generados por el CONTRATISTA son propiedad de la Alcaldía de Santiago de Cali. M) Cuando se requiera utilizar dispositivos y/o equipos tecnológicos personales o de la administración para el desarrollo del objeto contractual, el CONTRATISTA garantizará que el software y/o herramientas utilizadas e instaladas para la ejecución de sus obligaciones no vulneran ninguna normativa, contrato, derecho, interés, patentes, legalidad o propiedad de tercero, y que por el contrario todo lo utilizado esté debidamente licenciado. El CONTRATISTA debe abstenerse de instalar y/o utilizar software no licenciado o autorizado en los equipos del Distrito Especial de Santiago de Cali, así como de vulnerar los derechos de autor sobre software y/o cualquier tipo de creación protegida por el régimen de propiedad intelectual, so pena de incurrir en conductas constitutivas de delitos conforme a la normatividad legal correspondiente. N) Cumplir con las estrategias, políticas y actividades en materia de transparencia, integridad, prevención y detección de la corrupción y ante cualquier conocimiento de hechos que atente contra este principio, lo hará conocer al CONTRATANTE. O) Si el prestador del servicio contratado hace parte del equipo estructurador de los procesos de contratación del organismo o cumple actividades de apoyo a la supervisión, deberá aportar la constancia de aprobación de los cursos virtuales diseñados para fortalecer la gestión contractual por el Departamento Administrativo de Contratación Pública. P)  Divulgar y aplicar la política ambiental, de seguridad y salud ocupacional establecida por el CONTRATANTE, al ejecutar sus actividades o servicios sin crear riesgo para la salud, la seguridad o el ambiente. El (la) CONTRATISTA deberá tomar todas las medidas conducentes a evitar la contaminación ambiental, la prevención de riesgos durante la ejecución de sus operaciones o actividades y cumplirá con todas las leyes ambientales, de seguridad y salud ocupacional, aplicables. El (la) CONTRATISTA no dejará sustancias o materiales nocivos para la flora, fauna o salud humana, ni contaminará la atmósfera, el suelo o los </w:t>
       </w:r>
       <w:r>
         <w:rPr>
@@ -11706,7 +11767,7 @@
           <w:szCs w:val="24"/>
         </w:rPr>
         <w:lastRenderedPageBreak/>
-        <w:t>actividades y cumplirá con todas las leyes ambientales, de seguridad y salud ocupacional, aplicables. El (la) CONTRATISTA no dejará sustancias o materiales nocivos para la flora, fauna o salud humana, ni contaminará la atmósfera, el suelo o los cuerpos del agua. La violación de estas normas se considerará incumplimiento grave del contrato, y el CONTRATANTE podrá aplicar la cláusula penal o multas a que hubiere lugar, sin perjuicio de las demás acciones legales o sanciones que adelante la autoridad o ente competente de orden Distrital o Nacional. Q) El CONTRATISTA deberá coordinar con el supervisor la ejecución de las actividades contractuales, acatando sus instrucciones, con el fin de asegurar las condiciones necesarias para el desarrollo eficiente del objeto contractual.</w:t>
+        <w:t>cuerpos del agua. La violación de estas normas se considerará incumplimiento grave del contrato, y el CONTRATANTE podrá aplicar la cláusula penal o multas a que hubiere lugar, sin perjuicio de las demás acciones legales o sanciones que adelante la autoridad o ente competente de orden Distrital o Nacional. Q) El CONTRATISTA deberá coordinar con el supervisor la ejecución de las actividades contractuales, acatando sus instrucciones, con el fin de asegurar las condiciones necesarias para el desarrollo eficiente del objeto contractual.</w:t>
       </w:r>
     </w:p>
     <w:p>
@@ -11912,6 +11973,7 @@
           <w:sz w:val="24"/>
           <w:szCs w:val="24"/>
         </w:rPr>
+        <w:lastRenderedPageBreak/>
         <w:t>Por lo tanto, la contratación directa es un procedimiento reglado excepcionalmente y de aplicación e interpretación restrictiva, al cual pueden acudir las entidades públicas para celebrar contratos, en determinados eventos tipificados en la Ley.</w:t>
       </w:r>
     </w:p>
@@ -12145,35 +12207,35 @@
         </w:numPr>
       </w:pPr>
       <w:r>
+        <w:t xml:space="preserve">JUSTIFICACIÓN DEL TIPO DE PROPUESTA TÉCNICA </w:t>
+      </w:r>
+    </w:p>
+    <w:p>
+      <w:pPr>
+        <w:jc w:val="both"/>
+        <w:rPr>
+          <w:rFonts w:ascii="Arial" w:eastAsia="Arial" w:hAnsi="Arial" w:cs="Arial"/>
+          <w:sz w:val="24"/>
+          <w:szCs w:val="24"/>
+        </w:rPr>
+      </w:pPr>
+    </w:p>
+    <w:p>
+      <w:pPr>
+        <w:jc w:val="both"/>
+        <w:rPr>
+          <w:rFonts w:ascii="Arial" w:eastAsia="Arial" w:hAnsi="Arial" w:cs="Arial"/>
+          <w:sz w:val="24"/>
+          <w:szCs w:val="24"/>
+        </w:rPr>
+      </w:pPr>
+      <w:r>
+        <w:rPr>
+          <w:rFonts w:ascii="Arial" w:eastAsia="Arial" w:hAnsi="Arial" w:cs="Arial"/>
+          <w:sz w:val="24"/>
+          <w:szCs w:val="24"/>
+        </w:rPr>
         <w:lastRenderedPageBreak/>
-        <w:t xml:space="preserve">JUSTIFICACIÓN DEL TIPO DE PROPUESTA TÉCNICA </w:t>
-      </w:r>
-    </w:p>
-    <w:p>
-      <w:pPr>
-        <w:jc w:val="both"/>
-        <w:rPr>
-          <w:rFonts w:ascii="Arial" w:eastAsia="Arial" w:hAnsi="Arial" w:cs="Arial"/>
-          <w:sz w:val="24"/>
-          <w:szCs w:val="24"/>
-        </w:rPr>
-      </w:pPr>
-    </w:p>
-    <w:p>
-      <w:pPr>
-        <w:jc w:val="both"/>
-        <w:rPr>
-          <w:rFonts w:ascii="Arial" w:eastAsia="Arial" w:hAnsi="Arial" w:cs="Arial"/>
-          <w:sz w:val="24"/>
-          <w:szCs w:val="24"/>
-        </w:rPr>
-      </w:pPr>
-      <w:r>
-        <w:rPr>
-          <w:rFonts w:ascii="Arial" w:eastAsia="Arial" w:hAnsi="Arial" w:cs="Arial"/>
-          <w:sz w:val="24"/>
-          <w:szCs w:val="24"/>
-        </w:rPr>
         <w:t>No Aplica</w:t>
       </w:r>
     </w:p>
@@ -12497,26 +12559,26 @@
         </w:numPr>
       </w:pPr>
       <w:r>
+        <w:t>CAPACIDAD ORGANIZACIONAL</w:t>
+      </w:r>
+    </w:p>
+    <w:p/>
+    <w:p>
+      <w:pPr>
+        <w:jc w:val="both"/>
+        <w:rPr>
+          <w:rFonts w:ascii="Arial" w:eastAsia="Arial" w:hAnsi="Arial" w:cs="Arial"/>
+          <w:sz w:val="24"/>
+          <w:szCs w:val="24"/>
+        </w:rPr>
+      </w:pPr>
+      <w:r>
+        <w:rPr>
+          <w:rFonts w:ascii="Arial" w:eastAsia="Arial" w:hAnsi="Arial" w:cs="Arial"/>
+          <w:sz w:val="24"/>
+          <w:szCs w:val="24"/>
+        </w:rPr>
         <w:lastRenderedPageBreak/>
-        <w:t>CAPACIDAD ORGANIZACIONAL</w:t>
-      </w:r>
-    </w:p>
-    <w:p/>
-    <w:p>
-      <w:pPr>
-        <w:jc w:val="both"/>
-        <w:rPr>
-          <w:rFonts w:ascii="Arial" w:eastAsia="Arial" w:hAnsi="Arial" w:cs="Arial"/>
-          <w:sz w:val="24"/>
-          <w:szCs w:val="24"/>
-        </w:rPr>
-      </w:pPr>
-      <w:r>
-        <w:rPr>
-          <w:rFonts w:ascii="Arial" w:eastAsia="Arial" w:hAnsi="Arial" w:cs="Arial"/>
-          <w:sz w:val="24"/>
-          <w:szCs w:val="24"/>
-        </w:rPr>
         <w:t>No Aplica</w:t>
       </w:r>
     </w:p>
@@ -12941,7 +13003,6 @@
                 <w:sz w:val="24"/>
                 <w:szCs w:val="24"/>
               </w:rPr>
-              <w:lastRenderedPageBreak/>
               <w:t>APROBADOS</w:t>
             </w:r>
           </w:p>
@@ -14550,8 +14611,18 @@
           <w:sz w:val="24"/>
           <w:szCs w:val="24"/>
         </w:rPr>
+        <w:t xml:space="preserve">“Todos los contratos realizados mediante la modalidad de contratación directa estipuladas en la ley 1150 de 2007 no les aplican las obligaciones de los acuerdos </w:t>
+      </w:r>
+      <w:r>
+        <w:rPr>
+          <w:rFonts w:ascii="Arial" w:eastAsia="Arial" w:hAnsi="Arial" w:cs="Arial"/>
+          <w:i/>
+          <w:iCs/>
+          <w:sz w:val="24"/>
+          <w:szCs w:val="24"/>
+        </w:rPr>
         <w:lastRenderedPageBreak/>
-        <w:t>“Todos los contratos realizados mediante la modalidad de contratación directa estipuladas en la ley 1150 de 2007 no les aplican las obligaciones de los acuerdos internaciones y por lo tanto no se requiere establecer si están o no cubiertos por dichos acuerdos.”</w:t>
+        <w:t>internaciones y por lo tanto no se requiere establecer si están o no cubiertos por dichos acuerdos.”</w:t>
       </w:r>
     </w:p>
     <w:p>
@@ -15111,7 +15182,7 @@
                 <w:sz w:val="16"/>
                 <w:szCs w:val="16"/>
               </w:rPr>
-              <w:t>4</w:t>
+              <w:t>26</w:t>
             </w:r>
             <w:r>
               <w:rPr>
@@ -18663,6 +18734,12 @@
   </wne:recipientData>
   <wne:recipientData>
     <wne:active wne:val="0"/>
+  </wne:recipientData>
+  <wne:recipientData>
+    <wne:active wne:val="1"/>
+  </wne:recipientData>
+  <wne:recipientData>
+    <wne:active wne:val="1"/>
   </wne:recipientData>
   <wne:recipientData>
     <wne:active wne:val="1"/>
@@ -21761,7 +21838,7 @@
 </file>
 
 <file path=customXml/itemProps2.xml><?xml version="1.0" encoding="utf-8"?>
-<ds:datastoreItem xmlns:ds="http://schemas.openxmlformats.org/officeDocument/2006/customXml" ds:itemID="{6D59E8BF-7F65-4EE2-94AD-280EF5557FC0}">
+<ds:datastoreItem xmlns:ds="http://schemas.openxmlformats.org/officeDocument/2006/customXml" ds:itemID="{D272D23B-E39C-4E05-8DFF-15988DB55344}">
   <ds:schemaRefs>
     <ds:schemaRef ds:uri="http://schemas.openxmlformats.org/officeDocument/2006/bibliography"/>
   </ds:schemaRefs>

</xml_diff>

<commit_message>
feat: Integrar generacion automatica de documentos para contratos de funcionamiento y certificado insuficiencia
</commit_message>
<xml_diff>
--- a/plantillas/INVERSION_1_ESTUDIOS_PREVIOS.docx
+++ b/plantillas/INVERSION_1_ESTUDIOS_PREVIOS.docx
@@ -1197,7 +1197,23 @@
           <w:sz w:val="24"/>
           <w:szCs w:val="24"/>
         </w:rPr>
-        <w:t>Contrato de prestación de servicios profesionales_{{ MARCA_PROFESIONAL}} ___</w:t>
+        <w:t>Contrato de prestación de servicios profesionales</w:t>
+      </w:r>
+      <w:r>
+        <w:rPr>
+          <w:rFonts w:ascii="Arial" w:eastAsia="Arial" w:hAnsi="Arial" w:cs="Arial"/>
+          <w:sz w:val="24"/>
+          <w:szCs w:val="24"/>
+        </w:rPr>
+        <w:tab/>
+      </w:r>
+      <w:r>
+        <w:rPr>
+          <w:rFonts w:ascii="Arial" w:eastAsia="Arial" w:hAnsi="Arial" w:cs="Arial"/>
+          <w:sz w:val="24"/>
+          <w:szCs w:val="24"/>
+        </w:rPr>
+        <w:t>_{{ MARCA_PROFESIONAL}} ___</w:t>
       </w:r>
     </w:p>
     <w:p>
@@ -1223,7 +1239,32 @@
           <w:sz w:val="24"/>
           <w:szCs w:val="24"/>
         </w:rPr>
-        <w:t>Contrato de prestación de servicios de apoyo _{{MARCA_APOYO}}________</w:t>
+        <w:t xml:space="preserve">Contrato de prestación de servicios de apoyo </w:t>
+      </w:r>
+      <w:r>
+        <w:rPr>
+          <w:rFonts w:ascii="Arial" w:eastAsia="Arial" w:hAnsi="Arial" w:cs="Arial"/>
+          <w:sz w:val="24"/>
+          <w:szCs w:val="24"/>
+        </w:rPr>
+        <w:tab/>
+        <w:t xml:space="preserve">    </w:t>
+      </w:r>
+      <w:r>
+        <w:rPr>
+          <w:rFonts w:ascii="Arial" w:eastAsia="Arial" w:hAnsi="Arial" w:cs="Arial"/>
+          <w:sz w:val="24"/>
+          <w:szCs w:val="24"/>
+        </w:rPr>
+        <w:tab/>
+      </w:r>
+      <w:r>
+        <w:rPr>
+          <w:rFonts w:ascii="Arial" w:eastAsia="Arial" w:hAnsi="Arial" w:cs="Arial"/>
+          <w:sz w:val="24"/>
+          <w:szCs w:val="24"/>
+        </w:rPr>
+        <w:t>_{{MARCA_APOYO}}_</w:t>
       </w:r>
     </w:p>
     <w:p>
@@ -1772,6 +1813,17 @@
         <w:jc w:val="both"/>
         <w:rPr>
           <w:rFonts w:ascii="Arial" w:eastAsia="Arial" w:hAnsi="Arial" w:cs="Arial"/>
+        </w:rPr>
+      </w:pPr>
+      <w:bookmarkStart w:id="1" w:name="_GoBack"/>
+      <w:bookmarkEnd w:id="1"/>
+    </w:p>
+    <w:p>
+      <w:pPr>
+        <w:ind w:right="-106"/>
+        <w:jc w:val="both"/>
+        <w:rPr>
+          <w:rFonts w:ascii="Arial" w:eastAsia="Arial" w:hAnsi="Arial" w:cs="Arial"/>
           <w:sz w:val="24"/>
           <w:szCs w:val="24"/>
         </w:rPr>
@@ -1965,39 +2017,31 @@
           <w:sz w:val="24"/>
           <w:szCs w:val="24"/>
         </w:rPr>
-        <w:t xml:space="preserve">El artículo 3° de la Ley 80 de 1993 consagra que los servidores públicos tendrán en consideración que al celebrar contratos y con la ejecución de los mismos, las entidades </w:t>
-      </w:r>
-      <w:r>
-        <w:rPr>
-          <w:rFonts w:ascii="Arial" w:eastAsia="Arial" w:hAnsi="Arial" w:cs="Arial"/>
-          <w:sz w:val="24"/>
-          <w:szCs w:val="24"/>
-        </w:rPr>
         <w:lastRenderedPageBreak/>
-        <w:t>buscan el cumplimiento de los fines estatales, la continua y eficiente prestación de los servicios públicos y la efectividad de los derechos e intereses de los administrados.</w:t>
-      </w:r>
-    </w:p>
-    <w:p>
-      <w:pPr>
-        <w:jc w:val="both"/>
-        <w:rPr>
-          <w:rFonts w:ascii="Arial" w:eastAsia="Arial" w:hAnsi="Arial" w:cs="Arial"/>
-          <w:sz w:val="24"/>
-          <w:szCs w:val="24"/>
-        </w:rPr>
-      </w:pPr>
-    </w:p>
-    <w:p>
-      <w:pPr>
-        <w:jc w:val="both"/>
-        <w:rPr>
-          <w:rFonts w:ascii="Arial" w:eastAsia="Arial" w:hAnsi="Arial" w:cs="Arial"/>
-          <w:sz w:val="24"/>
-          <w:szCs w:val="24"/>
-        </w:rPr>
-      </w:pPr>
-      <w:bookmarkStart w:id="1" w:name="_heading=h.4r6sqhy77vwo" w:colFirst="0" w:colLast="0"/>
-      <w:bookmarkEnd w:id="1"/>
+        <w:t>El artículo 3° de la Ley 80 de 1993 consagra que los servidores públicos tendrán en consideración que al celebrar contratos y con la ejecución de los mismos, las entidades buscan el cumplimiento de los fines estatales, la continua y eficiente prestación de los servicios públicos y la efectividad de los derechos e intereses de los administrados.</w:t>
+      </w:r>
+    </w:p>
+    <w:p>
+      <w:pPr>
+        <w:jc w:val="both"/>
+        <w:rPr>
+          <w:rFonts w:ascii="Arial" w:eastAsia="Arial" w:hAnsi="Arial" w:cs="Arial"/>
+          <w:sz w:val="24"/>
+          <w:szCs w:val="24"/>
+        </w:rPr>
+      </w:pPr>
+    </w:p>
+    <w:p>
+      <w:pPr>
+        <w:jc w:val="both"/>
+        <w:rPr>
+          <w:rFonts w:ascii="Arial" w:eastAsia="Arial" w:hAnsi="Arial" w:cs="Arial"/>
+          <w:sz w:val="24"/>
+          <w:szCs w:val="24"/>
+        </w:rPr>
+      </w:pPr>
+      <w:bookmarkStart w:id="2" w:name="_heading=h.4r6sqhy77vwo" w:colFirst="0" w:colLast="0"/>
+      <w:bookmarkEnd w:id="2"/>
       <w:r>
         <w:rPr>
           <w:rFonts w:ascii="Arial" w:eastAsia="Arial" w:hAnsi="Arial" w:cs="Arial"/>
@@ -2313,6 +2357,7 @@
           <w:rFonts w:ascii="Arial" w:eastAsia="Arial" w:hAnsi="Arial" w:cs="Arial"/>
           <w:color w:val="000000"/>
         </w:rPr>
+        <w:lastRenderedPageBreak/>
         <w:t>Sustanciar para decisión del Alcalde Municipal la segunda instancia de los procesos disciplinarios de su competencia, así como los recursos en sede administrativa, cuando procedan.</w:t>
       </w:r>
     </w:p>
@@ -2340,7 +2385,6 @@
           <w:rFonts w:ascii="Arial" w:eastAsia="Arial" w:hAnsi="Arial" w:cs="Arial"/>
           <w:color w:val="000000"/>
         </w:rPr>
-        <w:lastRenderedPageBreak/>
         <w:t xml:space="preserve">Unificar, con carácter prevalente, la doctrina jurídica municipal cuando exista disparidad de criterios jurídicos entre sectores o al interior de un mismo sector, a solicitud del Alcalde y/o del nivel directivo. </w:t>
       </w:r>
     </w:p>
@@ -2849,6 +2893,7 @@
         <w:rPr>
           <w:rFonts w:ascii="Arial" w:eastAsia="Arial" w:hAnsi="Arial" w:cs="Arial"/>
         </w:rPr>
+        <w:lastRenderedPageBreak/>
         <w:t>Artículo 56. Funciones de la Subdirección de Defensa Judicial y Prevención del Daño Antijurídico. La Subdirección de Defensa Judicial y Prevención del Daño Anturídico tendrá por funciones, las siguientes:</w:t>
       </w:r>
     </w:p>
@@ -2892,7 +2937,6 @@
           <w:rFonts w:ascii="Arial" w:eastAsia="Arial" w:hAnsi="Arial" w:cs="Arial"/>
           <w:color w:val="000000"/>
         </w:rPr>
-        <w:lastRenderedPageBreak/>
         <w:t xml:space="preserve">Ejercer la representación judicial y extrajudicial del Municipio de Santiago de Cali conforme a las asignaciones y/o delegaciones que para el efecto expida el Alcalde Municipal. </w:t>
       </w:r>
     </w:p>
@@ -3260,16 +3304,8 @@
           <w:sz w:val="24"/>
           <w:szCs w:val="24"/>
         </w:rPr>
-        <w:t xml:space="preserve">En dicho plan, se planteó el propósito 3 “CALI CON BUEN GOBIERNO”, con el cual se le apunta a recobrar la confianza ciudadana sobre la administración pública a través de </w:t>
-      </w:r>
-      <w:r>
-        <w:rPr>
-          <w:rFonts w:ascii="Arial" w:eastAsia="Arial" w:hAnsi="Arial" w:cs="Arial"/>
-          <w:sz w:val="24"/>
-          <w:szCs w:val="24"/>
-        </w:rPr>
         <w:lastRenderedPageBreak/>
-        <w:t xml:space="preserve">acciones caracterizadas por su transparencia y la eficiencia en su gestión, con impacto sobre el territorio. </w:t>
+        <w:t xml:space="preserve">En dicho plan, se planteó el propósito 3 “CALI CON BUEN GOBIERNO”, con el cual se le apunta a recobrar la confianza ciudadana sobre la administración pública a través de acciones caracterizadas por su transparencia y la eficiencia en su gestión, con impacto sobre el territorio. </w:t>
       </w:r>
     </w:p>
     <w:p>
@@ -3390,16 +3426,8 @@
           <w:sz w:val="24"/>
           <w:szCs w:val="24"/>
         </w:rPr>
-        <w:t xml:space="preserve">Así, el reto de "Gestión pública al servicio del ciudadano", se orienta hacia el mejoramiento de la relación de la administración pública local con la ciudadanía, y esto se logra a partir de un enfoque de gobernanza en el que la alcaldía lidera los procesos </w:t>
-      </w:r>
-      <w:r>
-        <w:rPr>
-          <w:rFonts w:ascii="Arial" w:eastAsia="Arial" w:hAnsi="Arial" w:cs="Arial"/>
-          <w:sz w:val="24"/>
-          <w:szCs w:val="24"/>
-        </w:rPr>
         <w:lastRenderedPageBreak/>
-        <w:t>de construcción colectiva con los diferentes actores públicos, privados y de la sociedad civil.</w:t>
+        <w:t>Así, el reto de "Gestión pública al servicio del ciudadano", se orienta hacia el mejoramiento de la relación de la administración pública local con la ciudadanía, y esto se logra a partir de un enfoque de gobernanza en el que la alcaldía lidera los procesos de construcción colectiva con los diferentes actores públicos, privados y de la sociedad civil.</w:t>
       </w:r>
     </w:p>
     <w:p>
@@ -3528,7 +3556,7 @@
           <w:sz w:val="24"/>
           <w:szCs w:val="24"/>
         </w:rPr>
-        <w:t xml:space="preserve"> del proyecto en mención, se planteó la ejecución de varias actividades, dentro de las cuales se encuentran: Realizar seguimiento y control de la actividad litigiosa; Apoyar la etapa de cumplimiento y pago de sentencias y acuerdos conciliatorios del Distrito de Santiago de Cali; Apoyar la gestión jurídica normativa, en acciones que encaminen a brindar seguridad jurídica; Adquirir suministros  de apoyo para la actividad jurídica y judicial; Realizar jornadas de gestión del conocimiento en el ciclo de defensa jurídica y actualización normativa; Diseñar metodología de aprendizaje, para la adquisición y reaprendizaje del conocimiento tácito y explícito; Realizar la identificación de normas de carácter general y abstracto, que puedan ser identificadas como depurables y aplicar los criterios para su depuración; Realizar la identificación de normas de carácter general y abstracto, que puedan ser identificadas como depurables y aplicar los criterios para su </w:t>
+        <w:t xml:space="preserve"> del proyecto en mención, se planteó la ejecución de varias actividades, dentro de las cuales se encuentran: Realizar seguimiento y control de la actividad litigiosa; Apoyar la etapa de cumplimiento y pago de sentencias y acuerdos conciliatorios del Distrito de Santiago de Cali; Apoyar la gestión jurídica normativa, en acciones que encaminen a brindar seguridad jurídica; Adquirir suministros  de apoyo para la actividad jurídica y judicial; Realizar jornadas de gestión del conocimiento en el ciclo de defensa jurídica y actualización normativa; Diseñar metodología de aprendizaje, para la adquisición y reaprendizaje del conocimiento tácito y explícito; Realizar la identificación de normas de </w:t>
       </w:r>
       <w:r>
         <w:rPr>
@@ -3537,7 +3565,7 @@
           <w:szCs w:val="24"/>
         </w:rPr>
         <w:lastRenderedPageBreak/>
-        <w:t>depuración; Apoyar la visualización del Modelo Predictivo de fallos judiciales en el sistema de información de procesos; Implementar solución tecnológica para el registro de tutelas en el sistema de información; Brindar soporte técnico, mantenimiento, desarrollo y actualización de los sistemas de información; Procesar y analizar los datos estadísticos de los sistemas de información; Adquirir equipos tecnológicos para los sistemas de información; Adquirir componentes tecnológicos o periféricos para equipos de cómputo; Adquirir licencias ofimáticas.</w:t>
+        <w:t>carácter general y abstracto, que puedan ser identificadas como depurables y aplicar los criterios para su depuración; Realizar la identificación de normas de carácter general y abstracto, que puedan ser identificadas como depurables y aplicar los criterios para su depuración; Apoyar la visualización del Modelo Predictivo de fallos judiciales en el sistema de información de procesos; Implementar solución tecnológica para el registro de tutelas en el sistema de información; Brindar soporte técnico, mantenimiento, desarrollo y actualización de los sistemas de información; Procesar y analizar los datos estadísticos de los sistemas de información; Adquirir equipos tecnológicos para los sistemas de información; Adquirir componentes tecnológicos o periféricos para equipos de cómputo; Adquirir licencias ofimáticas.</w:t>
       </w:r>
     </w:p>
     <w:p>
@@ -3868,7 +3896,17 @@
           <w:sz w:val="24"/>
           <w:szCs w:val="24"/>
         </w:rPr>
-        <w:t xml:space="preserve">En este entendido y revisada la planta de personal de la Entidad, se ha podido establecer que no se cuenta con personal suficiente que atienda funciones o desarrolle actividades iguales o relacionadas con el asunto objeto de contratación y actividades antes descritas, como se acredita con la certificación que en tal sentido ha expedido el Subdirector de Gestión Estratégica del Talento Humano del Departamento Administrativo de Desarrollo e Innovación Institucional de la Alcaldía de Santiago de Cali, mediante oficio No. </w:t>
+        <w:t xml:space="preserve">En este entendido y revisada la planta de personal de la Entidad, se ha podido establecer que no se cuenta con personal suficiente que atienda funciones o desarrolle actividades iguales o relacionadas con el asunto objeto de contratación y actividades antes descritas, como se acredita con la certificación que en tal sentido ha expedido el Subdirector de Gestión Estratégica del Talento Humano del Departamento Administrativo de Desarrollo e Innovación Institucional de la Alcaldía de Santiago de </w:t>
+      </w:r>
+      <w:r>
+        <w:rPr>
+          <w:rFonts w:ascii="Arial" w:eastAsia="Arial" w:hAnsi="Arial" w:cs="Arial"/>
+          <w:color w:val="000000"/>
+          <w:sz w:val="24"/>
+          <w:szCs w:val="24"/>
+        </w:rPr>
+        <w:lastRenderedPageBreak/>
+        <w:t xml:space="preserve">Cali, mediante oficio No. </w:t>
       </w:r>
       <w:r>
         <w:rPr>
@@ -3931,7 +3969,6 @@
           <w:sz w:val="24"/>
           <w:szCs w:val="24"/>
         </w:rPr>
-        <w:lastRenderedPageBreak/>
         <w:t>Mientras persista la necesidad del fortalecimiento de las funciones de este organismo de la Administración Central del Distrito Especial de Santiago de Cali, y en la planta de este no se cuente con el personal idóneo y con la experiencia necesaria para el cumplimiento de las actividades antes descritas, considerando que las mismas se orientan al apoyo del cumplimiento de las metas e indicadores del Plan de desarrollo, el Departamento Administrativo de Gestión Jurídica Pública con el fin de robustecer el apoyo a la ejecución de sus funciones y propósito, específicamente realizar el objeto contractual que se indica a continuación: {{OBJETO_CONTRACTUAL}}.</w:t>
       </w:r>
     </w:p>
@@ -4066,7 +4103,7 @@
           <w:sz w:val="24"/>
           <w:szCs w:val="24"/>
         </w:rPr>
-        <w:t xml:space="preserve">Mediante Decreto No. 4112.010.20.1025 del 10 de diciembre de 2025, se otorgó atribuciones en materia de contratación a los Secretarios de Despacho, Directores de Departamentos Administrativos y Directores de las Unidades Administrativas Especiales sin Personería jurídica del Distrito Especial, Deportivo, Cultural, turístico, Empresarial  y de Servicios de Santiago de Cali, en virtud de lo previsto en los artículos 24 y 28 del decreto No. 411.0.20.0516 de septiembre 28 de 2016, y el numeral 1.6 del artículo 2 del Decreto N° 4112.010.20.0025 de enero 12 de 2024, modificado por el Decreto No. 4112.010.20.0438 de junio 4 de 2024 y el Decreto No. 4112.010.20.0399 de junio 20 de 2025, en el marco del literal h) número 4 del Artículo 2 de la ley 1150 de 2007, reglamentada en la Subsección 4, Articulo 2.2.1.2.1.4.9 del decreto 1082 de 2015, para suscribir todos los actos y documentos precontractuales, contractuales y pos contractuales de los contratos de prestación de servicios profesionales y de apoyo a la gestión, cuya fuente de financiación sean gastos de Funcionamiento con las siguientes Posiciones Presupuestales del Anexo 2A – Gastos Entidades que hacen parte del Presupuesto General de las Entidades Territoriales del Catalogo Presupuestal para </w:t>
+        <w:t xml:space="preserve">Mediante Decreto No. 4112.010.20.1025 del 10 de diciembre de 2025, se otorgó atribuciones en materia de contratación a los Secretarios de Despacho, Directores de Departamentos Administrativos y Directores de las Unidades Administrativas Especiales sin Personería jurídica del Distrito Especial, Deportivo, Cultural, turístico, Empresarial  y de Servicios de Santiago de Cali, en virtud de lo previsto en los artículos 24 y 28 del decreto No. 411.0.20.0516 de septiembre 28 de 2016, y el numeral 1.6 del artículo 2 del Decreto N° 4112.010.20.0025 de enero 12 de 2024, modificado por el Decreto No. 4112.010.20.0438 de junio 4 de 2024 y el Decreto No. 4112.010.20.0399 de junio 20 de 2025, en el marco del literal h) número 4 del Artículo 2 de la ley 1150 de 2007, reglamentada en la Subsección 4, Articulo 2.2.1.2.1.4.9 del decreto 1082 de 2015, para suscribir todos los actos y documentos precontractuales, contractuales y pos contractuales de los contratos de prestación de servicios profesionales y de apoyo a la </w:t>
       </w:r>
       <w:r>
         <w:rPr>
@@ -4075,7 +4112,7 @@
           <w:szCs w:val="24"/>
         </w:rPr>
         <w:lastRenderedPageBreak/>
-        <w:t>Entidades Territoriales - CCPET expedido por la Dirección General de Apoyo Fiscal del Ministerio de Hacienda y Crédito Público:</w:t>
+        <w:t>gestión, cuya fuente de financiación sean gastos de Funcionamiento con las siguientes Posiciones Presupuestales del Anexo 2A – Gastos Entidades que hacen parte del Presupuesto General de las Entidades Territoriales del Catalogo Presupuestal para Entidades Territoriales - CCPET expedido por la Dirección General de Apoyo Fiscal del Ministerio de Hacienda y Crédito Público:</w:t>
       </w:r>
     </w:p>
     <w:p>
@@ -4665,7 +4702,16 @@
           <w:sz w:val="24"/>
           <w:szCs w:val="24"/>
         </w:rPr>
-        <w:t>Teniendo en cuenta que el objeto a contratar se encuentra sujeto a la necesidad del servicio del organismo, entendiéndose que su duración es por el tiempo limitado e indispensable para ejecutar las obligaciones contractuales, el futuro contratista estará sujeto a la coordinación de las actividades a desarrollar y a las orientaciones que sobre el particular le imparta el supervisor, conservando en todo caso plena autonomía para la ejecución eficiente del contrato. Sin que ello implique que exista subordinación, ni relación laboral o dependencia alguna frente al Distrito Especial de Santiago de Cali.</w:t>
+        <w:t xml:space="preserve">Teniendo en cuenta que el objeto a contratar se encuentra sujeto a la necesidad del servicio del organismo, entendiéndose que su duración es por el tiempo limitado e indispensable para ejecutar las obligaciones contractuales, el futuro contratista estará sujeto a la coordinación de las actividades a desarrollar y a las orientaciones que sobre el particular le imparta el supervisor, conservando en todo caso plena autonomía para la </w:t>
+      </w:r>
+      <w:r>
+        <w:rPr>
+          <w:rFonts w:ascii="Arial" w:eastAsia="Arial" w:hAnsi="Arial" w:cs="Arial"/>
+          <w:sz w:val="24"/>
+          <w:szCs w:val="24"/>
+        </w:rPr>
+        <w:lastRenderedPageBreak/>
+        <w:t>ejecución eficiente del contrato. Sin que ello implique que exista subordinación, ni relación laboral o dependencia alguna frente al Distrito Especial de Santiago de Cali.</w:t>
       </w:r>
     </w:p>
     <w:p>
@@ -4695,8 +4741,8 @@
           <w:szCs w:val="24"/>
         </w:rPr>
       </w:pPr>
-      <w:bookmarkStart w:id="2" w:name="_heading=h.as67lgeciqr3" w:colFirst="0" w:colLast="0"/>
-      <w:bookmarkEnd w:id="2"/>
+      <w:bookmarkStart w:id="3" w:name="_heading=h.as67lgeciqr3" w:colFirst="0" w:colLast="0"/>
+      <w:bookmarkEnd w:id="3"/>
       <w:r>
         <w:rPr>
           <w:rFonts w:ascii="Arial" w:eastAsia="Arial" w:hAnsi="Arial" w:cs="Arial"/>
@@ -4704,7 +4750,6 @@
           <w:sz w:val="24"/>
           <w:szCs w:val="24"/>
         </w:rPr>
-        <w:lastRenderedPageBreak/>
         <w:t>Mediante Decreto No. 4112.010.20.1049 del 17 de diciembre de 2025, el Alcalde Distrital expidió el presupuesto General de Rentas y Recursos de Capital y apropiaciones presupuestales para gastos de Santiago de Cali para la vigencia comprendida entre el 01 de enero y 31 de diciembre del año 2026, el cual se liquidó a través del Decreto No. 4112.010.20.1069 de diciembre 23 de 2025.</w:t>
       </w:r>
     </w:p>
@@ -5635,16 +5680,8 @@
           <w:szCs w:val="24"/>
         </w:rPr>
       </w:pPr>
-      <w:bookmarkStart w:id="3" w:name="_heading=h.eg5eloko88xw" w:colFirst="0" w:colLast="0"/>
-      <w:bookmarkEnd w:id="3"/>
-      <w:r>
-        <w:rPr>
-          <w:rFonts w:ascii="Arial" w:eastAsia="Arial" w:hAnsi="Arial" w:cs="Arial"/>
-          <w:sz w:val="24"/>
-          <w:szCs w:val="24"/>
-        </w:rPr>
-        <w:t xml:space="preserve">El Plan Anual de Adquisiciones de la Entidad no ha sido publicado, por no haberse vencido los términos legales establecidos en la Circular Externa Única de Colombia Compra Eficiente Versión 02 del 15 de julio de 2022, página 26 apartado 5.6 </w:t>
-      </w:r>
+      <w:bookmarkStart w:id="4" w:name="_heading=h.eg5eloko88xw" w:colFirst="0" w:colLast="0"/>
+      <w:bookmarkEnd w:id="4"/>
       <w:r>
         <w:rPr>
           <w:rFonts w:ascii="Arial" w:eastAsia="Arial" w:hAnsi="Arial" w:cs="Arial"/>
@@ -5652,7 +5689,7 @@
           <w:szCs w:val="24"/>
         </w:rPr>
         <w:lastRenderedPageBreak/>
-        <w:t>Publicación del Plan Anual de Adquisiciones: Las Entidades Estatales deben publicar el Plan Anual de Adquisiciones en el SECOP a más tardar el 31 de enero de cada año, identificando los bienes y servicios con el Clasificador de Bienes y Servicios de Naciones Unidas (UNSPSC).</w:t>
+        <w:t>El Plan Anual de Adquisiciones de la Entidad no ha sido publicado, por no haberse vencido los términos legales establecidos en la Circular Externa Única de Colombia Compra Eficiente Versión 02 del 15 de julio de 2022, página 26 apartado 5.6 Publicación del Plan Anual de Adquisiciones: Las Entidades Estatales deben publicar el Plan Anual de Adquisiciones en el SECOP a más tardar el 31 de enero de cada año, identificando los bienes y servicios con el Clasificador de Bienes y Servicios de Naciones Unidas (UNSPSC).</w:t>
       </w:r>
     </w:p>
     <w:p>
@@ -7233,36 +7270,45 @@
           <w:sz w:val="24"/>
           <w:szCs w:val="24"/>
         </w:rPr>
-        <w:t>El Departamento Administrativo de Gestión Jurídica Pública identificó que el sector relativo al objeto del presente proceso de contratación está integrado por el conjunto de personas naturales y/o jurídicas que prestan sus servicios a las entidades del Estado. El mercado colombiano cuenta con una oferta amplia de personas naturales y/o jurídicas que prestan sus servicios en diferentes asuntos que apoyan el funcionamiento de las entidades públicas. El perfil del posible contratista se define por el conocimiento previo, la formación académica y la experiencia relacionada directamente con el objeto de la presente contratación.</w:t>
-      </w:r>
-    </w:p>
-    <w:p>
-      <w:pPr>
-        <w:jc w:val="both"/>
+        <w:t xml:space="preserve">El Departamento Administrativo de Gestión Jurídica Pública identificó que el sector relativo al objeto del presente proceso de contratación está integrado por el conjunto de personas naturales y/o jurídicas que prestan sus servicios a las entidades del Estado. El mercado colombiano cuenta con una oferta amplia de personas naturales y/o jurídicas que prestan sus servicios en diferentes asuntos que apoyan el funcionamiento de las entidades públicas. El perfil del posible contratista se define por el conocimiento previo, </w:t>
+      </w:r>
+      <w:r>
         <w:rPr>
           <w:rFonts w:ascii="Arial" w:eastAsia="Arial" w:hAnsi="Arial" w:cs="Arial"/>
           <w:color w:val="000000"/>
           <w:sz w:val="24"/>
           <w:szCs w:val="24"/>
         </w:rPr>
-      </w:pPr>
-    </w:p>
-    <w:p>
-      <w:pPr>
-        <w:jc w:val="both"/>
-        <w:rPr>
-          <w:rFonts w:ascii="Arial" w:eastAsia="Arial" w:hAnsi="Arial" w:cs="Arial"/>
-          <w:sz w:val="24"/>
-          <w:szCs w:val="24"/>
-        </w:rPr>
-      </w:pPr>
-      <w:r>
-        <w:rPr>
-          <w:rFonts w:ascii="Arial" w:eastAsia="Arial" w:hAnsi="Arial" w:cs="Arial"/>
-          <w:sz w:val="24"/>
-          <w:szCs w:val="24"/>
-        </w:rPr>
         <w:lastRenderedPageBreak/>
+        <w:t>la formación académica y la experiencia relacionada directamente con el objeto de la presente contratación.</w:t>
+      </w:r>
+    </w:p>
+    <w:p>
+      <w:pPr>
+        <w:jc w:val="both"/>
+        <w:rPr>
+          <w:rFonts w:ascii="Arial" w:eastAsia="Arial" w:hAnsi="Arial" w:cs="Arial"/>
+          <w:color w:val="000000"/>
+          <w:sz w:val="24"/>
+          <w:szCs w:val="24"/>
+        </w:rPr>
+      </w:pPr>
+    </w:p>
+    <w:p>
+      <w:pPr>
+        <w:jc w:val="both"/>
+        <w:rPr>
+          <w:rFonts w:ascii="Arial" w:eastAsia="Arial" w:hAnsi="Arial" w:cs="Arial"/>
+          <w:sz w:val="24"/>
+          <w:szCs w:val="24"/>
+        </w:rPr>
+      </w:pPr>
+      <w:r>
+        <w:rPr>
+          <w:rFonts w:ascii="Arial" w:eastAsia="Arial" w:hAnsi="Arial" w:cs="Arial"/>
+          <w:sz w:val="24"/>
+          <w:szCs w:val="24"/>
+        </w:rPr>
         <w:t xml:space="preserve">Para determinar el valor estimado del contrato de conformidad con las actividades encaminadas al cumplimiento del mismo, se ha tomado como base y referencia los valores promedios de contrataciones anteriores y especialmente la Circular </w:t>
       </w:r>
       <w:r>
@@ -7273,8 +7319,6 @@
         </w:rPr>
         <w:t>{{CIRCULAR_HONORARIOS}}</w:t>
       </w:r>
-      <w:bookmarkStart w:id="4" w:name="_GoBack"/>
-      <w:bookmarkEnd w:id="4"/>
       <w:r>
         <w:rPr>
           <w:rFonts w:ascii="Arial" w:eastAsia="Arial" w:hAnsi="Arial" w:cs="Arial"/>
@@ -7418,16 +7462,7 @@
           <w:sz w:val="24"/>
           <w:szCs w:val="24"/>
         </w:rPr>
-        <w:t xml:space="preserve">Los servicios profesionales y de apoyo a la gestión son un elemento esencial para el funcionamiento de las empresas y organizaciones, tanto de orden privado, como </w:t>
-      </w:r>
-      <w:r>
-        <w:rPr>
-          <w:rFonts w:ascii="Arial" w:eastAsia="Arial" w:hAnsi="Arial" w:cs="Arial"/>
-          <w:sz w:val="24"/>
-          <w:szCs w:val="24"/>
-        </w:rPr>
-        <w:lastRenderedPageBreak/>
-        <w:t>público. Durante años, estos servicios han sido un requerimiento primordial para el desarrollo de actividades fundamentales en el mejoramiento y crecimiento económico, organizacional y operativo de las organizaciones públicas y privadas.</w:t>
+        <w:t>Los servicios profesionales y de apoyo a la gestión son un elemento esencial para el funcionamiento de las empresas y organizaciones, tanto de orden privado, como público. Durante años, estos servicios han sido un requerimiento primordial para el desarrollo de actividades fundamentales en el mejoramiento y crecimiento económico, organizacional y operativo de las organizaciones públicas y privadas.</w:t>
       </w:r>
     </w:p>
     <w:p>
@@ -7960,6 +7995,7 @@
               <w:rPr>
                 <w:rFonts w:ascii="Arial" w:eastAsia="Arial" w:hAnsi="Arial" w:cs="Arial"/>
               </w:rPr>
+              <w:lastRenderedPageBreak/>
               <w:t>POSTGRADO</w:t>
             </w:r>
           </w:p>
@@ -11360,7 +11396,6 @@
           <w:sz w:val="24"/>
           <w:szCs w:val="24"/>
         </w:rPr>
-        <w:lastRenderedPageBreak/>
         <w:t xml:space="preserve">No Aplica </w:t>
       </w:r>
     </w:p>
@@ -11666,7 +11701,6 @@
           <w:sz w:val="24"/>
           <w:szCs w:val="24"/>
         </w:rPr>
-        <w:lastRenderedPageBreak/>
         <w:t>Sin perjuicio de las demás obligaciones que se desprenden de la Constitución Política de Colombia, del Estatuto General de Contratación de la Administración Pública, de las particulares que correspondan a la naturaleza del contrato a celebrar, de aquellas contenidas en otros documentos del proceso y de las consignadas específicamente en el contenido del contrato, el contratista, entre otras, realizará las siguientes actividades:</w:t>
       </w:r>
     </w:p>
@@ -11749,7 +11783,7 @@
           <w:sz w:val="24"/>
           <w:szCs w:val="24"/>
         </w:rPr>
-        <w:t xml:space="preserve">A) Utilizar todos sus conocimientos e idoneidad en la ejecución del presente contrato, comprometiéndose a tramitar y entregar los productos y actividades que hacen parte del presente contrato con calidad y oportunidad. B) Presentar los informes requeridos por el contratante para el seguimiento de las tareas encomendadas. Una vez finalice el objeto del contrato, el CONTRATISTA deberá entregar al supervisor, un informe detallado de las actividades realizadas durante su ejecución indicando los asuntos asignados, tramitados y pendientes por resolver, así como los archivos físicos y magnéticos que se hubieren generado durante la ejecución del mismo, los informes antes citados deben entregarse en una (1) copia de seguridad, que deberá reposar en las instalaciones del contratante. C) Manejar la documentación a su cargo de conformidad con la Ley 594 del 2000, Ley General de Archivo, las políticas operativas del Proceso Gestión Documental, las políticas del Sistema de Gestión Documental y demás plataformas institucionales. El CONTRATISTA debe entregar inventariada al contratante y/o al supervisor, las carpetas y documentación que tenga a su cargo en virtud del desarrollo del objeto del presente contrato, entrega que deberá hacerse de acuerdo con los procedimientos establecidos por el contratante. D) El CONTRATISTA se compromete a cumplir con las normas y procedimientos sobre el Sistema de Gestión de Seguridad Social y Salud en el trabajo de la Entidad. Si en el desarrollo del objeto contractual se realizan actividades de campo y/o visitas a obras, el CONTRATISTA, a sus expensas, deberá dotarse y acudir a estos lugares con los implementos de seguridad industrial mínimos requeridos, tales como casco, botas, gafas protectoras, etc. E) En el evento en que el CONTRATISTA al momento de suscribir el presente contrato no sea responsable del impuesto a las ventas y durante la vigencia del mismo adquiera la obligación de inscribirse como responsable del impuesto a la renta, se compromete a realizar cambio ante la DIAN dentro de los términos que otorga la ley y a reportar dicha situación al CONTRATANTE para lo cual aportará el RUT actualizado, lo anterior de conformidad con normativa vigente aplicable. F) El CONTRATISTA se compromete a mantener actualizados todos </w:t>
+        <w:t xml:space="preserve">A) Utilizar todos sus conocimientos e idoneidad en la ejecución del presente contrato, comprometiéndose a tramitar y entregar los productos y actividades que hacen parte del presente contrato con calidad y oportunidad. B) Presentar los informes requeridos por el contratante para el seguimiento de las tareas encomendadas. Una vez finalice el objeto del contrato, el CONTRATISTA deberá entregar al supervisor, un informe detallado de las actividades realizadas durante su ejecución indicando los asuntos asignados, tramitados y pendientes por resolver, así como los archivos físicos y magnéticos que se hubieren generado durante la ejecución del mismo, los informes antes citados deben entregarse en una (1) copia de seguridad, que deberá reposar en las instalaciones del contratante. C) Manejar la documentación a su cargo de conformidad con la Ley 594 del 2000, Ley General de Archivo, las políticas operativas del Proceso Gestión Documental, las políticas del Sistema de Gestión Documental y demás plataformas institucionales. El CONTRATISTA debe entregar inventariada al contratante y/o al supervisor, las carpetas y documentación que tenga a su cargo en virtud del desarrollo del objeto del presente contrato, entrega que deberá hacerse de acuerdo con los procedimientos establecidos por el contratante. D) El CONTRATISTA se compromete a cumplir con las normas y procedimientos sobre el Sistema de Gestión de Seguridad Social y Salud en el trabajo de la Entidad. Si en el desarrollo del objeto contractual se realizan actividades de campo y/o visitas a obras, el CONTRATISTA, a sus expensas, deberá dotarse y acudir a estos lugares con los implementos de seguridad industrial mínimos requeridos, tales como casco, botas, gafas protectoras, etc. E) En el evento en que el CONTRATISTA al momento de suscribir el presente contrato no sea responsable del impuesto a las ventas y durante la vigencia del mismo adquiera la obligación de inscribirse como responsable del impuesto a la renta, se compromete a realizar cambio ante la DIAN </w:t>
       </w:r>
       <w:r>
         <w:rPr>
@@ -11758,7 +11792,7 @@
           <w:szCs w:val="24"/>
         </w:rPr>
         <w:lastRenderedPageBreak/>
-        <w:t xml:space="preserve">sus documentos en la Entidad, especialmente el RUT. G) Velar por el buen uso de los bienes entregados por el supervisor o el CONTRATANTE para realizar sus actividades. H) Reportar al CONTRATANTE el número de cuenta bancaria de ahorro o corriente, donde se le ha de consignar el pago derivado de la ejecución del presente contrato. I)  Conocer y aplicar las directrices, metodologías, políticas y procedimientos enmarcados dentro de los Sistemas de Gestión y Control Integrado adoptados por la Administración Central del Distrito de Santiago de Cali y, particularmente, los que se relacionan con el objeto del presente contrato. J) Cumplir con la política de seguridad de la información establecida por la Entidad, con el fin de garantizar la confidencialidad, integridad y disponibilidad de la información bajo su responsabilidad. K) Mantener actualizado el registro en los sistemas de información del contratante en tiempo real, cuando a ello hubiere lugar. L) Toda información o formatos generados por el CONTRATISTA son propiedad de la Alcaldía de Santiago de Cali. M) Cuando se requiera utilizar dispositivos y/o equipos tecnológicos personales o de la administración para el desarrollo del objeto contractual, el CONTRATISTA garantizará que el software y/o herramientas utilizadas e instaladas para la ejecución de sus obligaciones no vulneran ninguna normativa, contrato, derecho, interés, patentes, legalidad o propiedad de tercero, y que por el contrario todo lo utilizado esté debidamente licenciado. El CONTRATISTA debe abstenerse de instalar y/o utilizar software no licenciado o autorizado en los equipos del Distrito Especial de Santiago de Cali, así como de vulnerar los derechos de autor sobre software y/o cualquier tipo de creación protegida por el régimen de propiedad intelectual, so pena de incurrir en conductas constitutivas de delitos conforme a la normatividad legal correspondiente. N) Cumplir con las estrategias, políticas y actividades en materia de transparencia, integridad, prevención y detección de la corrupción y ante cualquier conocimiento de hechos que atente contra este principio, lo hará conocer al CONTRATANTE. O) Si el prestador del servicio contratado hace parte del equipo estructurador de los procesos de contratación del organismo o cumple actividades de apoyo a la supervisión, deberá aportar la constancia de aprobación de los cursos virtuales diseñados para fortalecer la gestión contractual por el Departamento Administrativo de Contratación Pública. P)  Divulgar y aplicar la política ambiental, de seguridad y salud ocupacional establecida por el CONTRATANTE, al ejecutar sus actividades o servicios sin crear riesgo para la salud, la seguridad o el ambiente. El (la) CONTRATISTA deberá tomar todas las medidas conducentes a evitar la contaminación ambiental, la prevención de riesgos durante la ejecución de sus operaciones o actividades y cumplirá con todas las leyes ambientales, de seguridad y salud ocupacional, aplicables. El (la) CONTRATISTA no dejará sustancias o materiales nocivos para la flora, fauna o salud humana, ni contaminará la atmósfera, el suelo o los </w:t>
+        <w:t xml:space="preserve">dentro de los términos que otorga la ley y a reportar dicha situación al CONTRATANTE para lo cual aportará el RUT actualizado, lo anterior de conformidad con normativa vigente aplicable. F) El CONTRATISTA se compromete a mantener actualizados todos sus documentos en la Entidad, especialmente el RUT. G) Velar por el buen uso de los bienes entregados por el supervisor o el CONTRATANTE para realizar sus actividades. H) Reportar al CONTRATANTE el número de cuenta bancaria de ahorro o corriente, donde se le ha de consignar el pago derivado de la ejecución del presente contrato. I)  Conocer y aplicar las directrices, metodologías, políticas y procedimientos enmarcados dentro de los Sistemas de Gestión y Control Integrado adoptados por la Administración Central del Distrito de Santiago de Cali y, particularmente, los que se relacionan con el objeto del presente contrato. J) Cumplir con la política de seguridad de la información establecida por la Entidad, con el fin de garantizar la confidencialidad, integridad y disponibilidad de la información bajo su responsabilidad. K) Mantener actualizado el registro en los sistemas de información del contratante en tiempo real, cuando a ello hubiere lugar. L) Toda información o formatos generados por el CONTRATISTA son propiedad de la Alcaldía de Santiago de Cali. M) Cuando se requiera utilizar dispositivos y/o equipos tecnológicos personales o de la administración para el desarrollo del objeto contractual, el CONTRATISTA garantizará que el software y/o herramientas utilizadas e instaladas para la ejecución de sus obligaciones no vulneran ninguna normativa, contrato, derecho, interés, patentes, legalidad o propiedad de tercero, y que por el contrario todo lo utilizado esté debidamente licenciado. El CONTRATISTA debe abstenerse de instalar y/o utilizar software no licenciado o autorizado en los equipos del Distrito Especial de Santiago de Cali, así como de vulnerar los derechos de autor sobre software y/o cualquier tipo de creación protegida por el régimen de propiedad intelectual, so pena de incurrir en conductas constitutivas de delitos conforme a la normatividad legal correspondiente. N) Cumplir con las estrategias, políticas y actividades en materia de transparencia, integridad, prevención y detección de la corrupción y ante cualquier conocimiento de hechos que atente contra este principio, lo hará conocer al CONTRATANTE. O) Si el prestador del servicio contratado hace parte del equipo estructurador de los procesos de contratación del organismo o cumple actividades de apoyo a la supervisión, deberá aportar la constancia de aprobación de los cursos virtuales diseñados para fortalecer la gestión contractual por el Departamento Administrativo de Contratación Pública. P)  Divulgar y aplicar la política ambiental, de seguridad y salud ocupacional establecida por el CONTRATANTE, al ejecutar sus actividades o servicios sin crear riesgo para la salud, la seguridad o el ambiente. El (la) CONTRATISTA deberá tomar todas las medidas conducentes a evitar la contaminación ambiental, la prevención de riesgos durante la ejecución de sus operaciones o </w:t>
       </w:r>
       <w:r>
         <w:rPr>
@@ -11767,7 +11801,7 @@
           <w:szCs w:val="24"/>
         </w:rPr>
         <w:lastRenderedPageBreak/>
-        <w:t>cuerpos del agua. La violación de estas normas se considerará incumplimiento grave del contrato, y el CONTRATANTE podrá aplicar la cláusula penal o multas a que hubiere lugar, sin perjuicio de las demás acciones legales o sanciones que adelante la autoridad o ente competente de orden Distrital o Nacional. Q) El CONTRATISTA deberá coordinar con el supervisor la ejecución de las actividades contractuales, acatando sus instrucciones, con el fin de asegurar las condiciones necesarias para el desarrollo eficiente del objeto contractual.</w:t>
+        <w:t>actividades y cumplirá con todas las leyes ambientales, de seguridad y salud ocupacional, aplicables. El (la) CONTRATISTA no dejará sustancias o materiales nocivos para la flora, fauna o salud humana, ni contaminará la atmósfera, el suelo o los cuerpos del agua. La violación de estas normas se considerará incumplimiento grave del contrato, y el CONTRATANTE podrá aplicar la cláusula penal o multas a que hubiere lugar, sin perjuicio de las demás acciones legales o sanciones que adelante la autoridad o ente competente de orden Distrital o Nacional. Q) El CONTRATISTA deberá coordinar con el supervisor la ejecución de las actividades contractuales, acatando sus instrucciones, con el fin de asegurar las condiciones necesarias para el desarrollo eficiente del objeto contractual.</w:t>
       </w:r>
     </w:p>
     <w:p>
@@ -11973,7 +12007,6 @@
           <w:sz w:val="24"/>
           <w:szCs w:val="24"/>
         </w:rPr>
-        <w:lastRenderedPageBreak/>
         <w:t>Por lo tanto, la contratación directa es un procedimiento reglado excepcionalmente y de aplicación e interpretación restrictiva, al cual pueden acudir las entidades públicas para celebrar contratos, en determinados eventos tipificados en la Ley.</w:t>
       </w:r>
     </w:p>
@@ -12207,6 +12240,7 @@
         </w:numPr>
       </w:pPr>
       <w:r>
+        <w:lastRenderedPageBreak/>
         <w:t xml:space="preserve">JUSTIFICACIÓN DEL TIPO DE PROPUESTA TÉCNICA </w:t>
       </w:r>
     </w:p>
@@ -12235,7 +12269,6 @@
           <w:sz w:val="24"/>
           <w:szCs w:val="24"/>
         </w:rPr>
-        <w:lastRenderedPageBreak/>
         <w:t>No Aplica</w:t>
       </w:r>
     </w:p>
@@ -12559,6 +12592,7 @@
         </w:numPr>
       </w:pPr>
       <w:r>
+        <w:lastRenderedPageBreak/>
         <w:t>CAPACIDAD ORGANIZACIONAL</w:t>
       </w:r>
     </w:p>
@@ -12578,7 +12612,6 @@
           <w:sz w:val="24"/>
           <w:szCs w:val="24"/>
         </w:rPr>
-        <w:lastRenderedPageBreak/>
         <w:t>No Aplica</w:t>
       </w:r>
     </w:p>
@@ -13003,6 +13036,7 @@
                 <w:sz w:val="24"/>
                 <w:szCs w:val="24"/>
               </w:rPr>
+              <w:lastRenderedPageBreak/>
               <w:t>APROBADOS</w:t>
             </w:r>
           </w:p>
@@ -14611,18 +14645,8 @@
           <w:sz w:val="24"/>
           <w:szCs w:val="24"/>
         </w:rPr>
-        <w:t xml:space="preserve">“Todos los contratos realizados mediante la modalidad de contratación directa estipuladas en la ley 1150 de 2007 no les aplican las obligaciones de los acuerdos </w:t>
-      </w:r>
-      <w:r>
-        <w:rPr>
-          <w:rFonts w:ascii="Arial" w:eastAsia="Arial" w:hAnsi="Arial" w:cs="Arial"/>
-          <w:i/>
-          <w:iCs/>
-          <w:sz w:val="24"/>
-          <w:szCs w:val="24"/>
-        </w:rPr>
         <w:lastRenderedPageBreak/>
-        <w:t>internaciones y por lo tanto no se requiere establecer si están o no cubiertos por dichos acuerdos.”</w:t>
+        <w:t>“Todos los contratos realizados mediante la modalidad de contratación directa estipuladas en la ley 1150 de 2007 no les aplican las obligaciones de los acuerdos internaciones y por lo tanto no se requiere establecer si están o no cubiertos por dichos acuerdos.”</w:t>
       </w:r>
     </w:p>
     <w:p>
@@ -18734,6 +18758,12 @@
   </wne:recipientData>
   <wne:recipientData>
     <wne:active wne:val="0"/>
+  </wne:recipientData>
+  <wne:recipientData>
+    <wne:active wne:val="1"/>
+  </wne:recipientData>
+  <wne:recipientData>
+    <wne:active wne:val="1"/>
   </wne:recipientData>
   <wne:recipientData>
     <wne:active wne:val="1"/>
@@ -21838,7 +21868,7 @@
 </file>
 
 <file path=customXml/itemProps2.xml><?xml version="1.0" encoding="utf-8"?>
-<ds:datastoreItem xmlns:ds="http://schemas.openxmlformats.org/officeDocument/2006/customXml" ds:itemID="{D272D23B-E39C-4E05-8DFF-15988DB55344}">
+<ds:datastoreItem xmlns:ds="http://schemas.openxmlformats.org/officeDocument/2006/customXml" ds:itemID="{01C8A590-FE71-4BC8-A472-C2D79AA2BF43}">
   <ds:schemaRefs>
     <ds:schemaRef ds:uri="http://schemas.openxmlformats.org/officeDocument/2006/bibliography"/>
   </ds:schemaRefs>

</xml_diff>